<commit_message>
docs: add detailed exam formats, grading criteria, and task schedules to official calendar
</commit_message>
<xml_diff>
--- a/Matemáticas para la Empresa I/Tareas/1 - Tarea General - Auditoría Matemática/Ficha_Auditoria_Matematica_RESUELTA_JPMorgan.docx
+++ b/Matemáticas para la Empresa I/Tareas/1 - Tarea General - Auditoría Matemática/Ficha_Auditoria_Matematica_RESUELTA_JPMorgan.docx
@@ -25,7 +25,7 @@
           <w:sz w:val="22"/>
           <w:b/>
         </w:rPr>
-        <w:t xml:space="preserve">Nombre y apellidos: Santiago [Estudiante ADE / Graduado en DAM]</w:t>
+        <w:t xml:space="preserve">Nombre y apellidos: Santiago [Graduado en DAM / Estudiante de ADE]</w:t>
       </w:r>
     </w:p>
     <w:p>
@@ -51,7 +51,7 @@
           <w:sz w:val="22"/>
           <w:i/>
         </w:rPr>
-        <w:t xml:space="preserve">Asignatura: Matemáticas para la Empresa I (Cód. 2350) — Profesora: Matilde Lafuente</w:t>
+        <w:t xml:space="preserve">Asignatura: Matemáticas para la Empresa I (Cód. 2350) — Profesora: Matilde Lafuente Lechuga</w:t>
       </w:r>
     </w:p>
     <w:p>
@@ -90,43 +90,43 @@
           <w:sz w:val="22"/>
           <w:b/>
         </w:rPr>
-        <w:t xml:space="preserve">Título o descripción del caso: The $6.2 Billion Spreadsheet Bug: Error en la agregación de volatilidades del modelo de Value at Risk (VaR) de JPMorgan Chase (London Whale)</w:t>
-      </w:r>
-    </w:p>
-    <w:p>
-      <w:pPr>
-        <w:spacing w:after="120" w:line="276" w:lineRule="auto"/>
-      </w:pPr>
-      <w:r>
-        <w:rPr>
-          <w:rFonts w:ascii="Calibri" w:hAnsi="Calibri"/>
-          <w:sz w:val="22"/>
-        </w:rPr>
-        <w:t xml:space="preserve">Fuente: U.S. Senate Permanent Subcommittee on Investigations / JPMorgan Management Task Force / Financial Times</w:t>
-      </w:r>
-    </w:p>
-    <w:p>
-      <w:pPr>
-        <w:spacing w:after="120" w:line="276" w:lineRule="auto"/>
-      </w:pPr>
-      <w:r>
-        <w:rPr>
-          <w:rFonts w:ascii="Calibri" w:hAnsi="Calibri"/>
-          <w:sz w:val="22"/>
-        </w:rPr>
-        <w:t xml:space="preserve">Fecha: Enero de 2012 (implementación del modelo) – Marzo de 2013 (auditoría forense oficial)</w:t>
-      </w:r>
-    </w:p>
-    <w:p>
-      <w:pPr>
-        <w:spacing w:after="120" w:line="276" w:lineRule="auto"/>
-      </w:pPr>
-      <w:r>
-        <w:rPr>
-          <w:rFonts w:ascii="Calibri" w:hAnsi="Calibri"/>
-          <w:sz w:val="22"/>
-        </w:rPr>
-        <w:t xml:space="preserve">Enlace o referencia: U.S. Senate Hearing Report on JPMorgan Whale Trades (Exhibit 103) &amp; JPMorgan Chase 2012 CIO Task Force Report</w:t>
+        <w:t xml:space="preserve">Título o descripción del caso: El error de cálculo de 6.200 millones de dólares: la fórmula de Excel de JPMorgan que dividió entre la suma en vez de hacer una media aritmética.</w:t>
+      </w:r>
+    </w:p>
+    <w:p>
+      <w:pPr>
+        <w:spacing w:after="120" w:line="276" w:lineRule="auto"/>
+      </w:pPr>
+      <w:r>
+        <w:rPr>
+          <w:rFonts w:ascii="Calibri" w:hAnsi="Calibri"/>
+          <w:sz w:val="22"/>
+        </w:rPr>
+        <w:t xml:space="preserve">Fuente: Informe Oficial del Senado de EE.UU. (Whale Trades Investigation) / Informe de Auditoría Interna de JPMorgan / Financial Times</w:t>
+      </w:r>
+    </w:p>
+    <w:p>
+      <w:pPr>
+        <w:spacing w:after="120" w:line="276" w:lineRule="auto"/>
+      </w:pPr>
+      <w:r>
+        <w:rPr>
+          <w:rFonts w:ascii="Calibri" w:hAnsi="Calibri"/>
+          <w:sz w:val="22"/>
+        </w:rPr>
+        <w:t xml:space="preserve">Fecha: 2012 (implementación del modelo en Excel) – 2013 (informe oficial de auditoría)</w:t>
+      </w:r>
+    </w:p>
+    <w:p>
+      <w:pPr>
+        <w:spacing w:after="120" w:line="276" w:lineRule="auto"/>
+      </w:pPr>
+      <w:r>
+        <w:rPr>
+          <w:rFonts w:ascii="Calibri" w:hAnsi="Calibri"/>
+          <w:sz w:val="22"/>
+        </w:rPr>
+        <w:t xml:space="preserve">Enlace o referencia: U.S. Senate Hearing on CIO Losses (Exhibit 103) &amp; JPMorgan Management Task Force Report (p. 128)</w:t>
       </w:r>
     </w:p>
     <w:p>
@@ -139,7 +139,7 @@
           <w:sz w:val="22"/>
           <w:i/>
         </w:rPr>
-        <w:t xml:space="preserve">Adjunto / Captura de evidencia (Transcripción oficial):</w:t>
+        <w:t xml:space="preserve">Fragmento transcrito del informe oficial de auditoría:</w:t>
       </w:r>
     </w:p>
     <w:p>
@@ -152,7 +152,7 @@
           <w:sz w:val="22"/>
           <w:i/>
         </w:rPr>
-        <w:t xml:space="preserve">«The model operated through a series of Excel spreadsheets, which had to be completed manually, by a process of copying and pasting data from one spreadsheet to another... The spreadsheet formula used to calculate net position risk divided by the sum of asset volatility metrics rather than their average. As a result, the model artificially depressed volatility estimates, reducing the portfolio's reported Value at Risk (VaR) by approximately 50%.» (Task Force Report, p. 128)</w:t>
+        <w:t xml:space="preserve">«El modelo funcionaba mediante hojas de cálculo de Excel que se completaban manualmente, copiando y pegando datos de una hoja a otra... La fórmula utilizada para calcular el riesgo neto cometió un error operativo crítico: en lugar de dividir por el promedio de dos métricas, dividió por su suma. Como resultado, el modelo redujo la volatilidad estimada a la mitad, ocultando el 50% del riesgo real acumulado.» (JPMorgan Task Force Report, p. 128)</w:t>
       </w:r>
     </w:p>
     <w:p>
@@ -177,19 +177,19 @@
           <w:rFonts w:ascii="Calibri" w:hAnsi="Calibri"/>
           <w:sz w:val="22"/>
         </w:rPr>
-        <w:t xml:space="preserve">La división Chief Investment Office (CIO) de JPMorgan Chase afirmó a sus comités de riesgo y a los reguladores de la Reserva Federal que su nuevo modelo interno de riesgo era más preciso y que el Value at Risk (VaR) de su cartera sintética de crédito se había reducido sustancialmente a principios de 2012.</w:t>
-      </w:r>
-    </w:p>
-    <w:p>
-      <w:pPr>
-        <w:spacing w:after="120" w:line="276" w:lineRule="auto"/>
-      </w:pPr>
-      <w:r>
-        <w:rPr>
-          <w:rFonts w:ascii="Calibri" w:hAnsi="Calibri"/>
-          <w:sz w:val="22"/>
-        </w:rPr>
-        <w:t xml:space="preserve">Respaldados en este informe falsamente optimista, los operadores liderados por Bruno Iksil acumularon masivas posiciones cortas y largas en derivados de crédito (CDS), creyendo que operaban holgadamente dentro de los límites de capital estatutario.</w:t>
+        <w:t xml:space="preserve">El departamento de inversión (CIO) de JPMorgan Chase afirmó a la dirección del banco y a los reguladores que el riesgo diario de su cartera de inversión se había reducido notablemente.</w:t>
+      </w:r>
+    </w:p>
+    <w:p>
+      <w:pPr>
+        <w:spacing w:after="120" w:line="276" w:lineRule="auto"/>
+      </w:pPr>
+      <w:r>
+        <w:rPr>
+          <w:rFonts w:ascii="Calibri" w:hAnsi="Calibri"/>
+          <w:sz w:val="22"/>
+        </w:rPr>
+        <w:t xml:space="preserve">Basándose en este dato erróneo de la hoja de cálculo, los operadores acumularon posiciones gigantescas en derivados crediticios, convencidos de que operaban con total seguridad. En realidad, el riesgo real no había bajado, sino que se había duplicado: la aparente tranquilidad era una ilusión provocada por un simple error de formulación en una celda de Excel.</w:t>
       </w:r>
     </w:p>
     <w:p>
@@ -214,43 +214,31 @@
           <w:rFonts w:ascii="Calibri" w:hAnsi="Calibri"/>
           <w:sz w:val="22"/>
         </w:rPr>
-        <w:t xml:space="preserve">1. Operadores de agregación y medias ponderadas en estadística multivariante frente a operadores de suma.</w:t>
-      </w:r>
-    </w:p>
-    <w:p>
-      <w:pPr>
-        <w:spacing w:after="120" w:line="276" w:lineRule="auto"/>
-      </w:pPr>
-      <w:r>
-        <w:rPr>
-          <w:rFonts w:ascii="Calibri" w:hAnsi="Calibri"/>
-          <w:sz w:val="22"/>
-        </w:rPr>
-        <w:t xml:space="preserve">2. Axiomas de medidas de riesgo coherentes (violación de Monotonicidad y Homogeneidad Positiva).</w:t>
-      </w:r>
-    </w:p>
-    <w:p>
-      <w:pPr>
-        <w:spacing w:after="120" w:line="276" w:lineRule="auto"/>
-      </w:pPr>
-      <w:r>
-        <w:rPr>
-          <w:rFonts w:ascii="Calibri" w:hAnsi="Calibri"/>
-          <w:sz w:val="22"/>
-        </w:rPr>
-        <w:t xml:space="preserve">3. Álgebra matricial y cálculo de dispersión: forma cuadrática de la matriz de varianzas-covarianzas en carteras financieras.</w:t>
-      </w:r>
-    </w:p>
-    <w:p>
-      <w:pPr>
-        <w:spacing w:after="120" w:line="276" w:lineRule="auto"/>
-      </w:pPr>
-      <w:r>
-        <w:rPr>
-          <w:rFonts w:ascii="Calibri" w:hAnsi="Calibri"/>
-          <w:sz w:val="22"/>
-        </w:rPr>
-        <w:t xml:space="preserve">4. Cálculo de funciones multivariantes y sensibilidades marginales (derivadas parciales negativas indebidas).</w:t>
+        <w:t xml:space="preserve">1. Media aritmética simple vs. División por la suma (Aritmética básica - Tema 0): confusión conceptual en el divisor entre el número de observaciones (N=2) y la suma de las propias variables.</w:t>
+      </w:r>
+    </w:p>
+    <w:p>
+      <w:pPr>
+        <w:spacing w:after="120" w:line="276" w:lineRule="auto"/>
+      </w:pPr>
+      <w:r>
+        <w:rPr>
+          <w:rFonts w:ascii="Calibri" w:hAnsi="Calibri"/>
+          <w:sz w:val="22"/>
+        </w:rPr>
+        <w:t xml:space="preserve">2. Funciones de una variable y signo de la derivada (Tema 1): una función de riesgo debe ser estrictamente creciente respecto a la volatilidad del mercado (derivada positiva: f'(x) &gt; 0). Al poner la variable en el denominador, el error convirtió la función en decreciente (derivada negativa: g'(x) &lt; 0).</w:t>
+      </w:r>
+    </w:p>
+    <w:p>
+      <w:pPr>
+        <w:spacing w:after="120" w:line="276" w:lineRule="auto"/>
+      </w:pPr>
+      <w:r>
+        <w:rPr>
+          <w:rFonts w:ascii="Calibri" w:hAnsi="Calibri"/>
+          <w:sz w:val="22"/>
+        </w:rPr>
+        <w:t xml:space="preserve">3. Porcentajes y proporcionalidad directa.</w:t>
       </w:r>
     </w:p>
     <w:p>
@@ -263,55 +251,154 @@
           <w:color w:val="1F497D"/>
           <w:sz w:val="24"/>
         </w:rPr>
-        <w:t xml:space="preserve">4. DIAGNÓSTICO MATEMÁTICO: REPRODUCCIÓN DEL ERROR PASO A PASO</w:t>
-      </w:r>
-    </w:p>
-    <w:p>
-      <w:pPr>
-        <w:spacing w:after="120" w:line="276" w:lineRule="auto"/>
-      </w:pPr>
-      <w:r>
-        <w:rPr>
-          <w:rFonts w:ascii="Calibri" w:hAnsi="Calibri"/>
-          <w:sz w:val="22"/>
-        </w:rPr>
-        <w:t xml:space="preserve">Para sintetizar dos estimaciones de dispersión temporal (s1 y s2), el diseño teórico requería la media aritmética: s_medio = (s1 + s2) / 2.</w:t>
-      </w:r>
-    </w:p>
-    <w:p>
-      <w:pPr>
-        <w:spacing w:after="120" w:line="276" w:lineRule="auto"/>
-      </w:pPr>
-      <w:r>
-        <w:rPr>
-          <w:rFonts w:ascii="Calibri" w:hAnsi="Calibri"/>
-          <w:sz w:val="22"/>
-        </w:rPr>
-        <w:t xml:space="preserve">En la hoja de cálculo de Excel, el modelizador programó en la fórmula una división por la suma: s_error = (s1 * s2) / (s1 + s2).</w:t>
-      </w:r>
-    </w:p>
-    <w:p>
-      <w:pPr>
-        <w:spacing w:after="120" w:line="276" w:lineRule="auto"/>
-      </w:pPr>
-      <w:r>
-        <w:rPr>
-          <w:rFonts w:ascii="Calibri" w:hAnsi="Calibri"/>
-          <w:sz w:val="22"/>
-        </w:rPr>
-        <w:t xml:space="preserve">Consecuencia analítica y funcional: al introducir la suma de las volatilidades como divisor, la derivada parcial de la métrica respecto a la volatilidad del mercado se convirtió en negativa en términos netos: ∂/∂s [exposición / (s1 + s2)] = - exposición / (s1 + s2)^2 &lt; 0.</w:t>
-      </w:r>
-    </w:p>
-    <w:p>
-      <w:pPr>
-        <w:spacing w:after="120" w:line="276" w:lineRule="auto"/>
-      </w:pPr>
-      <w:r>
-        <w:rPr>
-          <w:rFonts w:ascii="Calibri" w:hAnsi="Calibri"/>
-          <w:sz w:val="22"/>
-        </w:rPr>
-        <w:t xml:space="preserve">En consecuencia: a medida que el mercado entraba en tensión y aumentaba la volatilidad real, el modelo reportaba MENOS riesgo en lugar de más, enmascarando el 50% de la exposición y desactivando todas las alarmas tempranas.</w:t>
+        <w:t xml:space="preserve">4. DIAGNÓSTICO MATEMÁTICO: EXPLICACIÓN PASO A PASO CON NÚMEROS REALES</w:t>
+      </w:r>
+    </w:p>
+    <w:p>
+      <w:pPr>
+        <w:spacing w:after="120" w:line="276" w:lineRule="auto"/>
+      </w:pPr>
+      <w:r>
+        <w:rPr>
+          <w:rFonts w:ascii="Calibri" w:hAnsi="Calibri"/>
+          <w:sz w:val="22"/>
+          <w:b/>
+        </w:rPr>
+        <w:t xml:space="preserve">A) El cálculo correcto con números claros:</w:t>
+      </w:r>
+    </w:p>
+    <w:p>
+      <w:pPr>
+        <w:spacing w:after="120" w:line="276" w:lineRule="auto"/>
+      </w:pPr>
+      <w:r>
+        <w:rPr>
+          <w:rFonts w:ascii="Calibri" w:hAnsi="Calibri"/>
+          <w:sz w:val="22"/>
+        </w:rPr>
+        <w:t xml:space="preserve">Supongamos dos estimaciones de volatilidad del mercado: x1 = 10% (0,10) y x2 = 10% (0,10).</w:t>
+      </w:r>
+    </w:p>
+    <w:p>
+      <w:pPr>
+        <w:spacing w:after="120" w:line="276" w:lineRule="auto"/>
+      </w:pPr>
+      <w:r>
+        <w:rPr>
+          <w:rFonts w:ascii="Calibri" w:hAnsi="Calibri"/>
+          <w:sz w:val="22"/>
+        </w:rPr>
+        <w:t xml:space="preserve">La media aritmética correcta es: Promedio = (0,10 + 0,10) / 2 = 0,20 / 2 = 0,10 (10%).</w:t>
+      </w:r>
+    </w:p>
+    <w:p>
+      <w:pPr>
+        <w:spacing w:after="120" w:line="276" w:lineRule="auto"/>
+      </w:pPr>
+      <w:r>
+        <w:rPr>
+          <w:rFonts w:ascii="Calibri" w:hAnsi="Calibri"/>
+          <w:sz w:val="22"/>
+        </w:rPr>
+        <w:t xml:space="preserve">Para una inversión de 1.000 millones de dólares, el riesgo real es: 1.000M$ * 10% = 100 millones de dólares.</w:t>
+      </w:r>
+    </w:p>
+    <w:p>
+      <w:pPr>
+        <w:spacing w:after="120" w:line="276" w:lineRule="auto"/>
+      </w:pPr>
+      <w:r>
+        <w:rPr>
+          <w:rFonts w:ascii="Calibri" w:hAnsi="Calibri"/>
+          <w:sz w:val="22"/>
+          <w:b/>
+        </w:rPr>
+        <w:t xml:space="preserve">B) El error cometido en la celda de Excel:</w:t>
+      </w:r>
+    </w:p>
+    <w:p>
+      <w:pPr>
+        <w:spacing w:after="120" w:line="276" w:lineRule="auto"/>
+      </w:pPr>
+      <w:r>
+        <w:rPr>
+          <w:rFonts w:ascii="Calibri" w:hAnsi="Calibri"/>
+          <w:sz w:val="22"/>
+        </w:rPr>
+        <w:t xml:space="preserve">En lugar de dividir entre 2, el analista dividió entre la suma (0,10 + 0,10):</w:t>
+      </w:r>
+    </w:p>
+    <w:p>
+      <w:pPr>
+        <w:spacing w:after="120" w:line="276" w:lineRule="auto"/>
+      </w:pPr>
+      <w:r>
+        <w:rPr>
+          <w:rFonts w:ascii="Calibri" w:hAnsi="Calibri"/>
+          <w:sz w:val="22"/>
+        </w:rPr>
+        <w:t xml:space="preserve">Fórmula errónea de Excel = (0,10 * 0,10) / (0,10 + 0,10) = 0,01 / 0,20 = 0,05 (5%).</w:t>
+      </w:r>
+    </w:p>
+    <w:p>
+      <w:pPr>
+        <w:spacing w:after="120" w:line="276" w:lineRule="auto"/>
+      </w:pPr>
+      <w:r>
+        <w:rPr>
+          <w:rFonts w:ascii="Calibri" w:hAnsi="Calibri"/>
+          <w:sz w:val="22"/>
+        </w:rPr>
+        <w:t xml:space="preserve">Riesgo que mostró Excel en pantalla: 1.000M$ * 5% = 50 millones de dólares.</w:t>
+      </w:r>
+    </w:p>
+    <w:p>
+      <w:pPr>
+        <w:spacing w:after="120" w:line="276" w:lineRule="auto"/>
+      </w:pPr>
+      <w:r>
+        <w:rPr>
+          <w:rFonts w:ascii="Calibri" w:hAnsi="Calibri"/>
+          <w:sz w:val="22"/>
+        </w:rPr>
+        <w:t xml:space="preserve">¡El fallo hizo desaparecer la mitad del riesgo! La pantalla mostraba 50M$ cuando el riesgo real era de 100M$.</w:t>
+      </w:r>
+    </w:p>
+    <w:p>
+      <w:pPr>
+        <w:spacing w:after="120" w:line="276" w:lineRule="auto"/>
+      </w:pPr>
+      <w:r>
+        <w:rPr>
+          <w:rFonts w:ascii="Calibri" w:hAnsi="Calibri"/>
+          <w:sz w:val="22"/>
+          <w:b/>
+        </w:rPr>
+        <w:t xml:space="preserve">C) Demostración con la derivada (Tema 1):</w:t>
+      </w:r>
+    </w:p>
+    <w:p>
+      <w:pPr>
+        <w:spacing w:after="120" w:line="276" w:lineRule="auto"/>
+      </w:pPr>
+      <w:r>
+        <w:rPr>
+          <w:rFonts w:ascii="Calibri" w:hAnsi="Calibri"/>
+          <w:sz w:val="22"/>
+        </w:rPr>
+        <w:t xml:space="preserve">Función correcta esperada: f(x) = K * x, cuya derivada es f'(x) = K &gt; 0 (función creciente: a más volatilidad de mercado x, mayor riesgo medido).</w:t>
+      </w:r>
+    </w:p>
+    <w:p>
+      <w:pPr>
+        <w:spacing w:after="120" w:line="276" w:lineRule="auto"/>
+      </w:pPr>
+      <w:r>
+        <w:rPr>
+          <w:rFonts w:ascii="Calibri" w:hAnsi="Calibri"/>
+          <w:sz w:val="22"/>
+        </w:rPr>
+        <w:t xml:space="preserve">Función del fallo de Excel: g(x) = K / x = K * x^(-1), cuya derivada es g'(x) = -K / x^2 &lt; 0 (función decreciente). Al subir la volatilidad real, el modelo erróneo reportaba menos riesgo en pantalla.</w:t>
       </w:r>
     </w:p>
     <w:p>
@@ -374,7 +461,7 @@
           <w:sz w:val="22"/>
           <w:b/>
         </w:rPr>
-        <w:t xml:space="preserve">Justificación ADE: Es el error de cálculo con mayor impacto económico directo registrado en la historia financiera: pérdida directa de 6.200 millones de dólares en el balance de JPMorgan, sanciones regulatorias por más de 1.000 millones de dólares (SEC, CFTC, FCA), infracción de ratios de capital de Basilea II/III, renuncia de la alta dirección del CIO y caída del 15% del valor bursátil de la compañía.</w:t>
+        <w:t xml:space="preserve">Justificación ADE: Es el error de cálculo con mayor impacto económico directo de la historia financiera: pérdida directa de 6.200 millones de dólares en el balance de JPMorgan, sanciones de más de 1.000 millones de dólares impuestas por los reguladores (SEC/FCA), dimisión de los máximos directivos del área de inversión y una caída del 15% del valor en bolsa del banco.</w:t>
       </w:r>
     </w:p>
     <w:p>
@@ -399,55 +486,43 @@
           <w:rFonts w:ascii="Calibri" w:hAnsi="Calibri"/>
           <w:sz w:val="22"/>
         </w:rPr>
-        <w:t xml:space="preserve">Procedimiento riguroso de cálculo del Value at Risk (VaR 99% a 1 día):</w:t>
-      </w:r>
-    </w:p>
-    <w:p>
-      <w:pPr>
-        <w:spacing w:after="120" w:line="276" w:lineRule="auto"/>
-      </w:pPr>
-      <w:r>
-        <w:rPr>
-          <w:rFonts w:ascii="Calibri" w:hAnsi="Calibri"/>
-          <w:sz w:val="22"/>
-        </w:rPr>
-        <w:t xml:space="preserve">1. Matriz de covarianzas: Para dos componentes con ponderaciones w1 = w2 = 0.5 y correlación rho = 0.8: sigma_p = sqrt(w1^2 * s1^2 + w2^2 * s2^2 + 2 * w1 * w2 * rho * s1 * s2).</w:t>
-      </w:r>
-    </w:p>
-    <w:p>
-      <w:pPr>
-        <w:spacing w:after="120" w:line="276" w:lineRule="auto"/>
-      </w:pPr>
-      <w:r>
-        <w:rPr>
-          <w:rFonts w:ascii="Calibri" w:hAnsi="Calibri"/>
-          <w:sz w:val="22"/>
-        </w:rPr>
-        <w:t xml:space="preserve">2. Si se desea un estimador promediado de volatilidad: s_media = (s1 + s2) / 2 (escalar constante N=2 en denominador).</w:t>
-      </w:r>
-    </w:p>
-    <w:p>
-      <w:pPr>
-        <w:spacing w:after="120" w:line="276" w:lineRule="auto"/>
-      </w:pPr>
-      <w:r>
-        <w:rPr>
-          <w:rFonts w:ascii="Calibri" w:hAnsi="Calibri"/>
-          <w:sz w:val="22"/>
-        </w:rPr>
-        <w:t xml:space="preserve">3. VaR_0.99 = V_0 * z_0.99 * sigma_p * sqrt(1/252), con z_0.99 = 2.32635.</w:t>
-      </w:r>
-    </w:p>
-    <w:p>
-      <w:pPr>
-        <w:spacing w:after="120" w:line="276" w:lineRule="auto"/>
-      </w:pPr>
-      <w:r>
-        <w:rPr>
-          <w:rFonts w:ascii="Calibri" w:hAnsi="Calibri"/>
-          <w:sz w:val="22"/>
-        </w:rPr>
-        <w:t xml:space="preserve">Resultado comprobado mediante simulación: en un escenario de crisis con cartera de $10.000M, el modelo erróneo reportaba un VaR de solo $244.97M, cuando el riesgo real ascendía a $459.29M diarios (ocultando $214.32M de riesgo real por jornada, un -46.7% de desvío).</w:t>
+        <w:t xml:space="preserve">Fórmula corregida: La media aritmética entre dos estimaciones debe dividir estrictamente entre la constante entera N=2:</w:t>
+      </w:r>
+    </w:p>
+    <w:p>
+      <w:pPr>
+        <w:spacing w:after="120" w:line="276" w:lineRule="auto"/>
+      </w:pPr>
+      <w:r>
+        <w:rPr>
+          <w:rFonts w:ascii="Calibri" w:hAnsi="Calibri"/>
+          <w:sz w:val="22"/>
+        </w:rPr>
+        <w:t xml:space="preserve">Volatilidad media = (x1 + x2) / 2 = (0,10 + 0,10) / 2 = 0,10 (10%).</w:t>
+      </w:r>
+    </w:p>
+    <w:p>
+      <w:pPr>
+        <w:spacing w:after="120" w:line="276" w:lineRule="auto"/>
+      </w:pPr>
+      <w:r>
+        <w:rPr>
+          <w:rFonts w:ascii="Calibri" w:hAnsi="Calibri"/>
+          <w:sz w:val="22"/>
+        </w:rPr>
+        <w:t xml:space="preserve">Riesgo Diario Real = Inversión * Volatilidad media = 1.000M$ * 0,10 = 100 millones de dólares.</w:t>
+      </w:r>
+    </w:p>
+    <w:p>
+      <w:pPr>
+        <w:spacing w:after="120" w:line="276" w:lineRule="auto"/>
+      </w:pPr>
+      <w:r>
+        <w:rPr>
+          <w:rFonts w:ascii="Calibri" w:hAnsi="Calibri"/>
+          <w:sz w:val="22"/>
+        </w:rPr>
+        <w:t xml:space="preserve">Al corregir el divisor con la constante 2, la función recupera su derivada estrictamente positiva (f'(x) &gt; 0), garantizando que cuando aumente la inestabilidad del mercado, el modelo alerte del peligro.</w:t>
       </w:r>
     </w:p>
     <w:p>
@@ -472,43 +547,43 @@
           <w:rFonts w:ascii="Calibri" w:hAnsi="Calibri"/>
           <w:sz w:val="22"/>
         </w:rPr>
-        <w:t xml:space="preserve">Este caso ofrece tres aprendizajes críticos desde la perspectiva combinada DAM + ADE:</w:t>
-      </w:r>
-    </w:p>
-    <w:p>
-      <w:pPr>
-        <w:spacing w:after="120" w:line="276" w:lineRule="auto"/>
-      </w:pPr>
-      <w:r>
-        <w:rPr>
-          <w:rFonts w:ascii="Calibri" w:hAnsi="Calibri"/>
-          <w:sz w:val="22"/>
-        </w:rPr>
-        <w:t xml:space="preserve">1. Perspectiva DAM (Ingeniería de Software): El desastre evidenció los riesgos del 'Shadow IT' en finanzas. El uso de hojas de cálculo de Excel sin control de versiones (git), sin tipado de datos y sin pruebas unitarias automatizadas (Unit Tests) es una negligencia operativa. Con una batería básica de pruebas de aserción (assert var_alta_vol &gt; var_baja_vol), el modelo nunca habría pasado a producción.</w:t>
-      </w:r>
-    </w:p>
-    <w:p>
-      <w:pPr>
-        <w:spacing w:after="120" w:line="276" w:lineRule="auto"/>
-      </w:pPr>
-      <w:r>
-        <w:rPr>
-          <w:rFonts w:ascii="Calibri" w:hAnsi="Calibri"/>
-          <w:sz w:val="22"/>
-        </w:rPr>
-        <w:t xml:space="preserve">2. El paradigma Palantir Foundry / Data Pipelines: La gran banca moderna ha sustituido las hojas de cálculo aisladas por plataformas de datos empresariales donde los cálculos matemáticos son reproducibles, poseen linaje de datos auditable (data lineage) y se someten a procesos de Integración Continua (CI/CD) antes de alimentar decisiones ejecutivas.</w:t>
-      </w:r>
-    </w:p>
-    <w:p>
-      <w:pPr>
-        <w:spacing w:after="120" w:line="276" w:lineRule="auto"/>
-      </w:pPr>
-      <w:r>
-        <w:rPr>
-          <w:rFonts w:ascii="Calibri" w:hAnsi="Calibri"/>
-          <w:sz w:val="22"/>
-        </w:rPr>
-        <w:t xml:space="preserve">3. Perspectiva ADE (Gobernanza y Ética Directiva): Los directivos no deben tratar los modelos cuantitativos como 'cajas negras'. Es indispensable auditar las hipótesis matemáticas subyacentes, ya que una fórmula errónea puede quebrar un banco o desestabilizar el sistema financiero global.</w:t>
+        <w:t xml:space="preserve">Este caso une directamente mis estudios previos en DAM (programación) con mis estudios actuales en ADE:</w:t>
+      </w:r>
+    </w:p>
+    <w:p>
+      <w:pPr>
+        <w:spacing w:after="120" w:line="276" w:lineRule="auto"/>
+      </w:pPr>
+      <w:r>
+        <w:rPr>
+          <w:rFonts w:ascii="Calibri" w:hAnsi="Calibri"/>
+          <w:sz w:val="22"/>
+        </w:rPr>
+        <w:t xml:space="preserve">1. Perspectiva DAM (Programación y Calidad de Software): El banco cometió la imprudencia de basar decisiones de miles de millones de dólares en una hoja de Excel artesanal sin control de versiones ni pruebas unitarias (Unit Tests). Con una sola línea de comprobación en código ('assert riesgo_calculado == 100'), el ordenador habría detectado el error al instante y habría impedido su uso.</w:t>
+      </w:r>
+    </w:p>
+    <w:p>
+      <w:pPr>
+        <w:spacing w:after="120" w:line="276" w:lineRule="auto"/>
+      </w:pPr>
+      <w:r>
+        <w:rPr>
+          <w:rFonts w:ascii="Calibri" w:hAnsi="Calibri"/>
+          <w:sz w:val="22"/>
+        </w:rPr>
+        <w:t xml:space="preserve">2. La alternativa moderna (Palantir Foundry / Data Pipelines): En la actualidad, las grandes empresas y bancos evitan las hojas de cálculo manuales y emplean plataformas de datos donde los cálculos son automáticos, están verificados por programadores y no dependen de que una persona escriba una fórmula en una celda.</w:t>
+      </w:r>
+    </w:p>
+    <w:p>
+      <w:pPr>
+        <w:spacing w:after="120" w:line="276" w:lineRule="auto"/>
+      </w:pPr>
+      <w:r>
+        <w:rPr>
+          <w:rFonts w:ascii="Calibri" w:hAnsi="Calibri"/>
+          <w:sz w:val="22"/>
+        </w:rPr>
+        <w:t xml:space="preserve">3. Perspectiva ADE (Dirección de Empresas y Control Interno): Los directivos no deben fiarse a ciegas de una cifra solo porque aparezca en una hoja de cálculo o la arroje un ordenador. Quienes gestionan empresas deben auditar y comprender las operaciones elementales de las que dependen sus decisiones estratégicas.</w:t>
       </w:r>
     </w:p>
     <w:sectPr>

</xml_diff>